<commit_message>
feat: fortalecimiento de seguridad, resiliencia transaccional, normalización de contratos y arquitectura de procesos
</commit_message>
<xml_diff>
--- a/docs/arquitectura_sistema.docx
+++ b/docs/arquitectura_sistema.docx
@@ -914,7 +914,7 @@
                 <w:sz w:val="19"/>
                 <w:szCs w:val="19"/>
               </w:rPr>
-              <w:t xml:space="preserve">POST /auth/login. Retorna JWT (24h) y perfil. Error 401 unificado anti-enumeración. Sin password_hash. Frontend integrado; backend en sprint de cierre.</w:t>
+              <w:t xml:space="preserve">POST /auth/login. Retorna JWT (24h) y perfil. Error 401 unificado anti-enumeración. Sin password_hash. Frontend integrado y backend verificado.</w:t>
             </w:r>
           </w:p>
         </w:tc>
@@ -1012,39 +1012,39 @@
                 <w:sz w:val="19"/>
                 <w:szCs w:val="19"/>
               </w:rPr>
-              <w:t xml:space="preserve">Registro Usuarios [Obj. F2]</w:t>
-            </w:r>
-          </w:p>
-        </w:tc>
-        <w:tc>
-          <w:tcPr>
-            <w:tcBorders>
-              <w:top w:val="single" w:color="CBD5E1" w:sz="4"/>
-              <w:left w:val="single" w:color="CBD5E1" w:sz="4"/>
-              <w:bottom w:val="single" w:color="CBD5E1" w:sz="4"/>
-              <w:right w:val="single" w:color="CBD5E1" w:sz="4"/>
-            </w:tcBorders>
-            <w:tcMar>
-              <w:top w:type="dxa" w:w="100"/>
-              <w:left w:type="dxa" w:w="140"/>
-              <w:bottom w:type="dxa" w:w="100"/>
-              <w:right w:type="dxa" w:w="140"/>
-            </w:tcMar>
-          </w:tcPr>
-          <w:p>
-            <w:pPr>
-              <w:spacing w:line="260"/>
-            </w:pPr>
-            <w:r>
-              <w:rPr>
-                <w:rFonts w:ascii="Arial" w:cs="Arial" w:eastAsia="Arial" w:hAnsi="Arial"/>
-                <w:b w:val="false"/>
-                <w:bCs w:val="false"/>
-                <w:color w:val="334155"/>
-                <w:sz w:val="19"/>
-                <w:szCs w:val="19"/>
-              </w:rPr>
-              <w:t xml:space="preserve">POST /auth/register. Asignación de rol (admin/cajero). Clave Bcrypt (salt 10, &gt;=8 chars). UNIQUE(tenant, email). Backend en sprint de cierre.</w:t>
+              <w:t xml:space="preserve">Registro de Usuarios [Obj. F2]</w:t>
+            </w:r>
+          </w:p>
+        </w:tc>
+        <w:tc>
+          <w:tcPr>
+            <w:tcBorders>
+              <w:top w:val="single" w:color="CBD5E1" w:sz="4"/>
+              <w:left w:val="single" w:color="CBD5E1" w:sz="4"/>
+              <w:bottom w:val="single" w:color="CBD5E1" w:sz="4"/>
+              <w:right w:val="single" w:color="CBD5E1" w:sz="4"/>
+            </w:tcBorders>
+            <w:tcMar>
+              <w:top w:type="dxa" w:w="100"/>
+              <w:left w:type="dxa" w:w="140"/>
+              <w:bottom w:type="dxa" w:w="100"/>
+              <w:right w:type="dxa" w:w="140"/>
+            </w:tcMar>
+          </w:tcPr>
+          <w:p>
+            <w:pPr>
+              <w:spacing w:line="260"/>
+            </w:pPr>
+            <w:r>
+              <w:rPr>
+                <w:rFonts w:ascii="Arial" w:cs="Arial" w:eastAsia="Arial" w:hAnsi="Arial"/>
+                <w:b w:val="false"/>
+                <w:bCs w:val="false"/>
+                <w:color w:val="334155"/>
+                <w:sz w:val="19"/>
+                <w:szCs w:val="19"/>
+              </w:rPr>
+              <w:t xml:space="preserve">POST /auth/register y GET /auth/users. Asignación de rol (admin/cajero). Restringido a rol Admin bajo RBAC. Clave Bcrypt (salt 10, &gt;=8 chars). UNIQUE(tenant, email).</w:t>
             </w:r>
           </w:p>
         </w:tc>
@@ -1174,7 +1174,7 @@
                 <w:sz w:val="19"/>
                 <w:szCs w:val="19"/>
               </w:rPr>
-              <w:t xml:space="preserve">GET /auth/me. Valida cabecera Authorization: Bearer &lt;token&gt; para reanudación de sesión en recarga. Backend en sprint de cierre.</w:t>
+              <w:t xml:space="preserve">GET /auth/me. Valida cabecera Authorization: Bearer &lt;token&gt; para reanudación de sesión en recarga. Backend verificado.</w:t>
             </w:r>
           </w:p>
         </w:tc>
@@ -1434,7 +1434,7 @@
                 <w:sz w:val="19"/>
                 <w:szCs w:val="19"/>
               </w:rPr>
-              <w:t xml:space="preserve">Middleware de autenticación para toda la API v1 (excepto login/register) y control estricto de rol en rutas admin.</w:t>
+              <w:t xml:space="preserve">Middleware de autenticación para la API v1 (excepto login). Secure-by-default en producción (NODE_ENV=production salvo AUTH_DISABLED=true); configurable con ENFORCE_AUTH=true en dev.</w:t>
             </w:r>
           </w:p>
         </w:tc>
@@ -6321,7 +6321,7 @@
           <w:sz w:val="20"/>
           <w:szCs w:val="20"/>
         </w:rPr>
-        <w:t xml:space="preserve">Tokens firmados (HS256, 24h), control de acceso por roles (cajero con 6 vistas vs admin con 11 vistas) implementado con jsonwebtoken.</w:t>
+        <w:t xml:space="preserve">Tokens firmados (HS256, 24h), control de acceso por roles (cajero con 6 vistas vs admin con 11 vistas) implementado con jsonwebtoken. Política secure-by-default en producción (salvo AUTH_DISABLED=true) y configurable con ENFORCE_AUTH=true en dev.</w:t>
       </w:r>
     </w:p>
     <w:p>
@@ -6338,7 +6338,7 @@
           <w:sz w:val="20"/>
           <w:szCs w:val="20"/>
         </w:rPr>
-        <w:t xml:space="preserve">• RNF-SEG-02 (Almacenamiento Seguro de Contraseñas): </w:t>
+        <w:t xml:space="preserve">• RNF-SEG-02 (Almacenamiento Seguro de Contraseñas y Parche Idempotente): </w:t>
       </w:r>
       <w:r>
         <w:rPr>
@@ -6347,7 +6347,7 @@
           <w:sz w:val="20"/>
           <w:szCs w:val="20"/>
         </w:rPr>
-        <w:t xml:space="preserve">Cifrado de contraseñas mediante Bcrypt con work factor 10 (hashes de 60 caracteres reales en siembra) implementado con bcryptjs.</w:t>
+        <w:t xml:space="preserve">Cifrado de contraseñas mediante Bcrypt con work factor 10 (hashes de 60 caracteres reales). El procedimiento patchExistingDatabaseFixes() migra automáticamente bases de datos existentes a Bcrypt y normaliza RUT emisor a 76.123.456-0.</w:t>
       </w:r>
     </w:p>
     <w:p>
@@ -7655,7 +7655,7 @@
           <w:sz w:val="28"/>
           <w:szCs w:val="28"/>
         </w:rPr>
-        <w:t xml:space="preserve">6. Catálogo de Endpoints y Matriz de Trazabilidad (65 Endpoints)</w:t>
+        <w:t xml:space="preserve">6. Catálogo de Endpoints y Matriz de Trazabilidad (66 Endpoints)</w:t>
       </w:r>
     </w:p>
     <w:p>
@@ -7669,7 +7669,7 @@
           <w:sz w:val="20"/>
           <w:szCs w:val="20"/>
         </w:rPr>
-        <w:t xml:space="preserve">A continuación se resumen los 65 endpoints RESTful del sistema, indicando su rol de acceso mínimo:</w:t>
+        <w:t xml:space="preserve">A continuación se resumen los 66 endpoints RESTful del sistema, indicando su rol de acceso mínimo:</w:t>
       </w:r>
     </w:p>
     <w:tbl>
@@ -8182,7 +8182,7 @@
                 <w:sz w:val="19"/>
                 <w:szCs w:val="19"/>
               </w:rPr>
-              <w:t xml:space="preserve">Público</w:t>
+              <w:t xml:space="preserve">Admin</w:t>
             </w:r>
           </w:p>
         </w:tc>
@@ -8345,6 +8345,168 @@
                 <w:szCs w:val="19"/>
               </w:rPr>
               <w:t xml:space="preserve">Cajero</w:t>
+            </w:r>
+          </w:p>
+        </w:tc>
+      </w:tr>
+      <w:tr>
+        <w:tc>
+          <w:tcPr>
+            <w:tcBorders>
+              <w:top w:val="single" w:color="CBD5E1" w:sz="4"/>
+              <w:left w:val="single" w:color="CBD5E1" w:sz="4"/>
+              <w:bottom w:val="single" w:color="CBD5E1" w:sz="4"/>
+              <w:right w:val="single" w:color="CBD5E1" w:sz="4"/>
+            </w:tcBorders>
+            <w:tcMar>
+              <w:top w:type="dxa" w:w="100"/>
+              <w:left w:type="dxa" w:w="140"/>
+              <w:bottom w:type="dxa" w:w="100"/>
+              <w:right w:type="dxa" w:w="140"/>
+            </w:tcMar>
+          </w:tcPr>
+          <w:p>
+            <w:pPr>
+              <w:spacing w:line="260"/>
+            </w:pPr>
+            <w:r>
+              <w:rPr>
+                <w:rFonts w:ascii="Arial" w:cs="Arial" w:eastAsia="Arial" w:hAnsi="Arial"/>
+                <w:b w:val="false"/>
+                <w:bCs w:val="false"/>
+                <w:color w:val="334155"/>
+                <w:sz w:val="19"/>
+                <w:szCs w:val="19"/>
+              </w:rPr>
+              <w:t xml:space="preserve">Auth</w:t>
+            </w:r>
+          </w:p>
+        </w:tc>
+        <w:tc>
+          <w:tcPr>
+            <w:tcBorders>
+              <w:top w:val="single" w:color="CBD5E1" w:sz="4"/>
+              <w:left w:val="single" w:color="CBD5E1" w:sz="4"/>
+              <w:bottom w:val="single" w:color="CBD5E1" w:sz="4"/>
+              <w:right w:val="single" w:color="CBD5E1" w:sz="4"/>
+            </w:tcBorders>
+            <w:tcMar>
+              <w:top w:type="dxa" w:w="100"/>
+              <w:left w:type="dxa" w:w="140"/>
+              <w:bottom w:type="dxa" w:w="100"/>
+              <w:right w:type="dxa" w:w="140"/>
+            </w:tcMar>
+          </w:tcPr>
+          <w:p>
+            <w:pPr>
+              <w:spacing w:line="260"/>
+            </w:pPr>
+            <w:r>
+              <w:rPr>
+                <w:rFonts w:ascii="Arial" w:cs="Arial" w:eastAsia="Arial" w:hAnsi="Arial"/>
+                <w:b w:val="false"/>
+                <w:bCs w:val="false"/>
+                <w:color w:val="334155"/>
+                <w:sz w:val="19"/>
+                <w:szCs w:val="19"/>
+              </w:rPr>
+              <w:t xml:space="preserve">GET</w:t>
+            </w:r>
+          </w:p>
+        </w:tc>
+        <w:tc>
+          <w:tcPr>
+            <w:tcBorders>
+              <w:top w:val="single" w:color="CBD5E1" w:sz="4"/>
+              <w:left w:val="single" w:color="CBD5E1" w:sz="4"/>
+              <w:bottom w:val="single" w:color="CBD5E1" w:sz="4"/>
+              <w:right w:val="single" w:color="CBD5E1" w:sz="4"/>
+            </w:tcBorders>
+            <w:tcMar>
+              <w:top w:type="dxa" w:w="100"/>
+              <w:left w:type="dxa" w:w="140"/>
+              <w:bottom w:type="dxa" w:w="100"/>
+              <w:right w:type="dxa" w:w="140"/>
+            </w:tcMar>
+          </w:tcPr>
+          <w:p>
+            <w:pPr>
+              <w:spacing w:line="260"/>
+            </w:pPr>
+            <w:r>
+              <w:rPr>
+                <w:rFonts w:ascii="Arial" w:cs="Arial" w:eastAsia="Arial" w:hAnsi="Arial"/>
+                <w:b w:val="false"/>
+                <w:bCs w:val="false"/>
+                <w:color w:val="334155"/>
+                <w:sz w:val="19"/>
+                <w:szCs w:val="19"/>
+              </w:rPr>
+              <w:t xml:space="preserve">/api/v1/auth/users</w:t>
+            </w:r>
+          </w:p>
+        </w:tc>
+        <w:tc>
+          <w:tcPr>
+            <w:tcBorders>
+              <w:top w:val="single" w:color="CBD5E1" w:sz="4"/>
+              <w:left w:val="single" w:color="CBD5E1" w:sz="4"/>
+              <w:bottom w:val="single" w:color="CBD5E1" w:sz="4"/>
+              <w:right w:val="single" w:color="CBD5E1" w:sz="4"/>
+            </w:tcBorders>
+            <w:tcMar>
+              <w:top w:type="dxa" w:w="100"/>
+              <w:left w:type="dxa" w:w="140"/>
+              <w:bottom w:type="dxa" w:w="100"/>
+              <w:right w:type="dxa" w:w="140"/>
+            </w:tcMar>
+          </w:tcPr>
+          <w:p>
+            <w:pPr>
+              <w:spacing w:line="260"/>
+            </w:pPr>
+            <w:r>
+              <w:rPr>
+                <w:rFonts w:ascii="Arial" w:cs="Arial" w:eastAsia="Arial" w:hAnsi="Arial"/>
+                <w:b w:val="false"/>
+                <w:bCs w:val="false"/>
+                <w:color w:val="334155"/>
+                <w:sz w:val="19"/>
+                <w:szCs w:val="19"/>
+              </w:rPr>
+              <w:t xml:space="preserve">RF-02 [Obj. F2]</w:t>
+            </w:r>
+          </w:p>
+        </w:tc>
+        <w:tc>
+          <w:tcPr>
+            <w:tcBorders>
+              <w:top w:val="single" w:color="CBD5E1" w:sz="4"/>
+              <w:left w:val="single" w:color="CBD5E1" w:sz="4"/>
+              <w:bottom w:val="single" w:color="CBD5E1" w:sz="4"/>
+              <w:right w:val="single" w:color="CBD5E1" w:sz="4"/>
+            </w:tcBorders>
+            <w:tcMar>
+              <w:top w:type="dxa" w:w="100"/>
+              <w:left w:type="dxa" w:w="140"/>
+              <w:bottom w:type="dxa" w:w="100"/>
+              <w:right w:type="dxa" w:w="140"/>
+            </w:tcMar>
+          </w:tcPr>
+          <w:p>
+            <w:pPr>
+              <w:spacing w:line="260"/>
+            </w:pPr>
+            <w:r>
+              <w:rPr>
+                <w:rFonts w:ascii="Arial" w:cs="Arial" w:eastAsia="Arial" w:hAnsi="Arial"/>
+                <w:b w:val="false"/>
+                <w:bCs w:val="false"/>
+                <w:color w:val="334155"/>
+                <w:sz w:val="19"/>
+                <w:szCs w:val="19"/>
+              </w:rPr>
+              <w:t xml:space="preserve">Admin</w:t>
             </w:r>
           </w:p>
         </w:tc>
@@ -11132,7 +11294,7 @@
           <w:sz w:val="20"/>
           <w:szCs w:val="20"/>
         </w:rPr>
-        <w:t xml:space="preserve">La confiabilidad de GesTock está respaldada por una batería automatizada en Jest con 147 pruebas ejecutadas con un 100% de éxito (87 unitarias y 60 de integración).</w:t>
+        <w:t xml:space="preserve">La confiabilidad de GesTock está respaldada por una batería automatizada en Jest con 183 pruebas ejecutadas con un 100% de éxito (147 de backend y 36 de frontend, complementadas con 99 verificaciones E2E).</w:t>
       </w:r>
     </w:p>
     <w:tbl>
@@ -12204,7 +12366,7 @@
           <w:sz w:val="20"/>
           <w:szCs w:val="20"/>
         </w:rPr>
-        <w:t xml:space="preserve">Desarrollo en TypeScript estricto, 147 pruebas automatizadas y arquitectura Cloud-Native con Docker Compose.</w:t>
+        <w:t xml:space="preserve">Desarrollo en TypeScript estricto, 183 pruebas automatizadas y arquitectura Cloud-Native con Docker Compose.</w:t>
       </w:r>
     </w:p>
     <w:sectPr>

</xml_diff>

<commit_message>
Actualizar la documentación técnica con las cifras medidas de la batería de pruebas
</commit_message>
<xml_diff>
--- a/docs/arquitectura_sistema.docx
+++ b/docs/arquitectura_sistema.docx
@@ -6849,7 +6849,7 @@
           <w:sz w:val="20"/>
           <w:szCs w:val="20"/>
         </w:rPr>
-        <w:t>Validada mediante 269 pruebas automatizadas en Jest con 100% de éxito.</w:t>
+        <w:t>Validada mediante 280 pruebas automatizadas en Jest con 100% de éxito.</w:t>
       </w:r>
     </w:p>
     <w:p>
@@ -6866,7 +6866,7 @@
           <w:sz w:val="20"/>
           <w:szCs w:val="20"/>
         </w:rPr>
-        <w:t xml:space="preserve">• RNF-MANT-03 (Migraciones DDL 001-013): </w:t>
+        <w:t xml:space="preserve">• RNF-MANT-03 (Migraciones DDL 001-015): </w:t>
       </w:r>
       <w:r>
         <w:rPr>
@@ -11942,7 +11942,7 @@
           <w:sz w:val="20"/>
           <w:szCs w:val="20"/>
         </w:rPr>
-        <w:t>La confiabilidad de GesTock está respaldada por una batería automatizada en Jest con 269 pruebas ejecutadas con un 100% de éxito (258 de backend y 11 de frontend, complementadas con 81 verificaciones E2E).</w:t>
+        <w:t>La confiabilidad de GesTock está respaldada por una batería automatizada en Jest con 280 pruebas ejecutadas con un 100% de éxito (269 de backend y 11 de contrato de la interfaz), complementadas con 92 verificaciones de extremo a extremo.</w:t>
       </w:r>
     </w:p>
     <w:tbl>
@@ -13014,7 +13014,7 @@
           <w:sz w:val="20"/>
           <w:szCs w:val="20"/>
         </w:rPr>
-        <w:t>Desarrollo en TypeScript estricto, 269 pruebas automatizadas y arquitectura Cloud-Native con Docker Compose.</w:t>
+        <w:t>Desarrollo en TypeScript estricto, 280 pruebas automatizadas y arquitectura Cloud-Native con Docker Compose.</w:t>
       </w:r>
     </w:p>
     <w:sectPr>

</xml_diff>

<commit_message>
Actualizar la documentación técnica con la suite de vencimiento en reposición
</commit_message>
<xml_diff>
--- a/docs/arquitectura_sistema.docx
+++ b/docs/arquitectura_sistema.docx
@@ -6849,7 +6849,7 @@
           <w:sz w:val="20"/>
           <w:szCs w:val="20"/>
         </w:rPr>
-        <w:t>Validada mediante 280 pruebas automatizadas en Jest con 100% de éxito.</w:t>
+        <w:t>Validada mediante 286 pruebas automatizadas en Jest con 100% de éxito.</w:t>
       </w:r>
     </w:p>
     <w:p>
@@ -11942,7 +11942,7 @@
           <w:sz w:val="20"/>
           <w:szCs w:val="20"/>
         </w:rPr>
-        <w:t>La confiabilidad de GesTock está respaldada por una batería automatizada en Jest con 280 pruebas ejecutadas con un 100% de éxito (269 de backend y 11 de contrato de la interfaz), complementadas con 92 verificaciones de extremo a extremo.</w:t>
+        <w:t>La confiabilidad de GesTock está respaldada por una batería automatizada en Jest con 286 pruebas ejecutadas con un 100% de éxito (275 de backend y 11 de contrato de la interfaz), complementadas con 92 verificaciones de extremo a extremo.</w:t>
       </w:r>
     </w:p>
     <w:tbl>
@@ -13014,7 +13014,7 @@
           <w:sz w:val="20"/>
           <w:szCs w:val="20"/>
         </w:rPr>
-        <w:t>Desarrollo en TypeScript estricto, 280 pruebas automatizadas y arquitectura Cloud-Native con Docker Compose.</w:t>
+        <w:t>Desarrollo en TypeScript estricto, 286 pruebas automatizadas y arquitectura Cloud-Native con Docker Compose.</w:t>
       </w:r>
     </w:p>
     <w:sectPr>

</xml_diff>

<commit_message>
Actualizar la documentación técnica con la existencia por lote
</commit_message>
<xml_diff>
--- a/docs/arquitectura_sistema.docx
+++ b/docs/arquitectura_sistema.docx
@@ -6849,7 +6849,7 @@
           <w:sz w:val="20"/>
           <w:szCs w:val="20"/>
         </w:rPr>
-        <w:t>Validada mediante 286 pruebas automatizadas en Jest con 100% de éxito.</w:t>
+        <w:t>Validada mediante 298 pruebas automatizadas en Jest con 100% de éxito.</w:t>
       </w:r>
     </w:p>
     <w:p>
@@ -6866,7 +6866,7 @@
           <w:sz w:val="20"/>
           <w:szCs w:val="20"/>
         </w:rPr>
-        <w:t xml:space="preserve">• RNF-MANT-03 (Migraciones DDL 001-015): </w:t>
+        <w:t xml:space="preserve">• RNF-MANT-03 (Migraciones DDL 001-016): </w:t>
       </w:r>
       <w:r>
         <w:rPr>
@@ -7219,7 +7219,7 @@
           <w:sz w:val="20"/>
           <w:szCs w:val="20"/>
         </w:rPr>
-        <w:t xml:space="preserve">El esquema de datos relacional de GesTock está conformado por 29 tablas relacionales activas auditadas en las migraciones:</w:t>
+        <w:t>El esquema de datos relacional de GesTock está conformado por 30 tablas relacionales activas auditadas en las migraciones:</w:t>
       </w:r>
     </w:p>
     <w:p>
@@ -11942,7 +11942,7 @@
           <w:sz w:val="20"/>
           <w:szCs w:val="20"/>
         </w:rPr>
-        <w:t>La confiabilidad de GesTock está respaldada por una batería automatizada en Jest con 286 pruebas ejecutadas con un 100% de éxito (275 de backend y 11 de contrato de la interfaz), complementadas con 92 verificaciones de extremo a extremo.</w:t>
+        <w:t>La confiabilidad de GesTock está respaldada por una batería automatizada en Jest con 298 pruebas ejecutadas con un 100% de éxito (287 de backend y 11 de contrato de la interfaz), complementadas con 92 verificaciones de extremo a extremo.</w:t>
       </w:r>
     </w:p>
     <w:tbl>
@@ -12962,7 +12962,7 @@
           <w:sz w:val="20"/>
           <w:szCs w:val="20"/>
         </w:rPr>
-        <w:t xml:space="preserve">Las 5 vistas de Kruchten articuladas con el modelo de datos relacional de 29 tablas.</w:t>
+        <w:t>Las 5 vistas de Kruchten articuladas con el modelo de datos relacional de 30 tablas.</w:t>
       </w:r>
     </w:p>
     <w:p>
@@ -13014,7 +13014,7 @@
           <w:sz w:val="20"/>
           <w:szCs w:val="20"/>
         </w:rPr>
-        <w:t>Desarrollo en TypeScript estricto, 286 pruebas automatizadas y arquitectura Cloud-Native con Docker Compose.</w:t>
+        <w:t>Desarrollo en TypeScript estricto, 298 pruebas automatizadas y arquitectura Cloud-Native con Docker Compose.</w:t>
       </w:r>
     </w:p>
     <w:sectPr>

</xml_diff>

<commit_message>
Documentar la existencia por lote, su alcance y su comportamiento en la nube
</commit_message>
<xml_diff>
--- a/docs/arquitectura_sistema.docx
+++ b/docs/arquitectura_sistema.docx
@@ -6849,7 +6849,7 @@
           <w:sz w:val="20"/>
           <w:szCs w:val="20"/>
         </w:rPr>
-        <w:t>Validada mediante 298 pruebas automatizadas en Jest con 100% de éxito.</w:t>
+        <w:t>Validada mediante 303 pruebas automatizadas en Jest con 100% de éxito.</w:t>
       </w:r>
     </w:p>
     <w:p>
@@ -11942,7 +11942,7 @@
           <w:sz w:val="20"/>
           <w:szCs w:val="20"/>
         </w:rPr>
-        <w:t>La confiabilidad de GesTock está respaldada por una batería automatizada en Jest con 298 pruebas ejecutadas con un 100% de éxito (287 de backend y 11 de contrato de la interfaz), complementadas con 92 verificaciones de extremo a extremo.</w:t>
+        <w:t>La confiabilidad de GesTock está respaldada por una batería automatizada en Jest con 303 pruebas ejecutadas con un 100% de éxito (292 de backend y 11 de contrato de la interfaz), complementadas con 92 verificaciones de extremo a extremo.</w:t>
       </w:r>
     </w:p>
     <w:tbl>
@@ -13014,7 +13014,7 @@
           <w:sz w:val="20"/>
           <w:szCs w:val="20"/>
         </w:rPr>
-        <w:t>Desarrollo en TypeScript estricto, 298 pruebas automatizadas y arquitectura Cloud-Native con Docker Compose.</w:t>
+        <w:t>Desarrollo en TypeScript estricto, 303 pruebas automatizadas y arquitectura Cloud-Native con Docker Compose.</w:t>
       </w:r>
     </w:p>
     <w:sectPr>

</xml_diff>

<commit_message>
Documentar las tres situaciones del panel de vencimientos y la política de latencia
</commit_message>
<xml_diff>
--- a/docs/arquitectura_sistema.docx
+++ b/docs/arquitectura_sistema.docx
@@ -6849,7 +6849,7 @@
           <w:sz w:val="20"/>
           <w:szCs w:val="20"/>
         </w:rPr>
-        <w:t>Validada mediante 303 pruebas automatizadas en Jest con 100% de éxito.</w:t>
+        <w:t>Validada mediante 308 pruebas automatizadas en Jest con 100% de éxito.</w:t>
       </w:r>
     </w:p>
     <w:p>
@@ -11942,7 +11942,7 @@
           <w:sz w:val="20"/>
           <w:szCs w:val="20"/>
         </w:rPr>
-        <w:t>La confiabilidad de GesTock está respaldada por una batería automatizada en Jest con 303 pruebas ejecutadas con un 100% de éxito (292 de backend y 11 de contrato de la interfaz), complementadas con 92 verificaciones de extremo a extremo.</w:t>
+        <w:t>La confiabilidad de GesTock está respaldada por una batería automatizada en Jest con 308 pruebas ejecutadas con un 100% de éxito (297 de backend y 11 de contrato de la interfaz), complementadas con 92 verificaciones de extremo a extremo.</w:t>
       </w:r>
     </w:p>
     <w:tbl>
@@ -13014,7 +13014,7 @@
           <w:sz w:val="20"/>
           <w:szCs w:val="20"/>
         </w:rPr>
-        <w:t>Desarrollo en TypeScript estricto, 303 pruebas automatizadas y arquitectura Cloud-Native con Docker Compose.</w:t>
+        <w:t>Desarrollo en TypeScript estricto, 308 pruebas automatizadas y arquitectura Cloud-Native con Docker Compose.</w:t>
       </w:r>
     </w:p>
     <w:sectPr>

</xml_diff>

<commit_message>
Declarar las latencias como medición observada y retirar los iconos del documento
</commit_message>
<xml_diff>
--- a/docs/arquitectura_sistema.docx
+++ b/docs/arquitectura_sistema.docx
@@ -12061,7 +12061,7 @@
                 <w:sz w:val="19"/>
                 <w:szCs w:val="19"/>
               </w:rPr>
-              <w:t xml:space="preserve">Latencia Media</w:t>
+              <w:t>Latencia media observada</w:t>
             </w:r>
           </w:p>
         </w:tc>
@@ -12095,7 +12095,7 @@
                 <w:sz w:val="19"/>
                 <w:szCs w:val="19"/>
               </w:rPr>
-              <w:t xml:space="preserve">Resultado</w:t>
+              <w:t>Objetivo del RNF</w:t>
             </w:r>
           </w:p>
         </w:tc>
@@ -12225,7 +12225,7 @@
                 <w:sz w:val="19"/>
                 <w:szCs w:val="19"/>
               </w:rPr>
-              <w:t xml:space="preserve">Cumple (&lt; 10 ms) ✅</w:t>
+              <w:t>&lt; 10 ms</w:t>
             </w:r>
           </w:p>
         </w:tc>
@@ -12355,7 +12355,7 @@
                 <w:sz w:val="19"/>
                 <w:szCs w:val="19"/>
               </w:rPr>
-              <w:t xml:space="preserve">Cumple (&lt; 15 ms) ✅</w:t>
+              <w:t>&lt; 15 ms</w:t>
             </w:r>
           </w:p>
         </w:tc>
@@ -12485,7 +12485,7 @@
                 <w:sz w:val="19"/>
                 <w:szCs w:val="19"/>
               </w:rPr>
-              <w:t xml:space="preserve">Instantáneo ✅</w:t>
+              <w:t>0 ms</w:t>
             </w:r>
           </w:p>
         </w:tc>
@@ -12615,7 +12615,7 @@
                 <w:sz w:val="19"/>
                 <w:szCs w:val="19"/>
               </w:rPr>
-              <w:t xml:space="preserve">Cumple (&lt; 300 ms) ✅</w:t>
+              <w:t>&lt; 300 ms</w:t>
             </w:r>
           </w:p>
         </w:tc>
@@ -12745,7 +12745,7 @@
                 <w:sz w:val="19"/>
                 <w:szCs w:val="19"/>
               </w:rPr>
-              <w:t xml:space="preserve">Cumple (&lt; 400 ms) ✅</w:t>
+              <w:t>&lt; 400 ms</w:t>
             </w:r>
           </w:p>
         </w:tc>
@@ -12875,7 +12875,7 @@
                 <w:sz w:val="19"/>
                 <w:szCs w:val="19"/>
               </w:rPr>
-              <w:t xml:space="preserve">Cumple (&lt; 200 ms) ✅</w:t>
+              <w:t>&lt; 200 ms</w:t>
             </w:r>
           </w:p>
         </w:tc>

</xml_diff>

<commit_message>
Retirar del modelo y de la documentación las tendencias de mercado, y documentar la tabla de lotes
</commit_message>
<xml_diff>
--- a/docs/arquitectura_sistema.docx
+++ b/docs/arquitectura_sistema.docx
@@ -6840,7 +6840,7 @@
           <w:sz w:val="20"/>
           <w:szCs w:val="20"/>
         </w:rPr>
-        <w:t>• RNF-MANT-02 (Cobertura de Pruebas &gt; 85% en la lógica de negocio): Medida con `npm run test:coverage:total`, que ejecuta las dos baterías sobre el código del servidor: 78,71% de las sentencias y 87,96% de las funciones en el total, y por encima del 85% en los módulos de reglas de negocio (tributario 91,8%, facturas 92,4%, reabastecimiento 87,8%, caja 85,6%). Los valores más bajos corresponden a la integración con el servicio externo de reconocimiento (45,7%) y a las rutas (71,4%), estas últimas ejercitadas además por las 109 comprobaciones de extremo a extremo. 308 pruebas automatizadas con 100% de éxito.</w:t>
+        <w:t>• RNF-MANT-02 (Cobertura de Pruebas &gt; 85% en la lógica de negocio): Medida con `npm run test:coverage:total`, que ejecuta las dos baterías sobre el código del servidor: 78,71% de las sentencias y 87,96% de las funciones en el total, y por encima del 85% en los módulos de reglas de negocio (tributario 91,8%, facturas 92,4%, reabastecimiento 87,8%, caja 85,6%). Los valores más bajos corresponden a la integración con el servicio externo de reconocimiento (45,7%) y a las rutas (71,4%), estas últimas ejercitadas además por las 109 comprobaciones de extremo a extremo. 297 pruebas automatizadas con 100% de éxito.</w:t>
       </w:r>
       <w:r>
         <w:rPr>
@@ -6865,7 +6865,7 @@
           <w:sz w:val="20"/>
           <w:szCs w:val="20"/>
         </w:rPr>
-        <w:t xml:space="preserve">• RNF-MANT-03 (Migraciones DDL 001-016): </w:t>
+        <w:t xml:space="preserve">• RNF-MANT-03 (Migraciones DDL 001-017): </w:t>
       </w:r>
       <w:r>
         <w:rPr>
@@ -7218,7 +7218,7 @@
           <w:sz w:val="20"/>
           <w:szCs w:val="20"/>
         </w:rPr>
-        <w:t>El esquema de datos relacional de GesTock está conformado por 30 tablas relacionales activas auditadas en las migraciones:</w:t>
+        <w:t>El esquema de datos relacional de GesTock está conformado por 29 tablas relacionales activas auditadas en las migraciones:</w:t>
       </w:r>
     </w:p>
     <w:p>
@@ -7365,7 +7365,7 @@
           <w:sz w:val="20"/>
           <w:szCs w:val="20"/>
         </w:rPr>
-        <w:t xml:space="preserve">• Inteligencia de Mercado y Versionado DDL (2): </w:t>
+        <w:t>• Existencia por Lote y Versionado DDL (2): lotes, _migrations (Control y trazabilidad de migraciones DDL ejecutadas).</w:t>
       </w:r>
       <w:r>
         <w:rPr>
@@ -7374,7 +7374,6 @@
           <w:sz w:val="20"/>
           <w:szCs w:val="20"/>
         </w:rPr>
-        <w:t xml:space="preserve">market_trends, _migrations (Control y trazabilidad de migraciones DDL ejecutadas).</w:t>
       </w:r>
     </w:p>
     <w:p>
@@ -7654,7 +7653,7 @@
           <w:sz w:val="28"/>
           <w:szCs w:val="28"/>
         </w:rPr>
-        <w:t>6. Catálogo de Endpoints y Matriz de Trazabilidad (72 Endpoints)</w:t>
+        <w:t>6. Catálogo de Endpoints y Matriz de Trazabilidad (69 Endpoints)</w:t>
       </w:r>
     </w:p>
     <w:p>
@@ -7668,7 +7667,7 @@
           <w:sz w:val="20"/>
           <w:szCs w:val="20"/>
         </w:rPr>
-        <w:t>A continuación se resumen los 72 endpoints RESTful del sistema, indicando su rol de acceso mínimo:</w:t>
+        <w:t>A continuación se resumen los 69 endpoints RESTful del sistema, indicando su rol de acceso mínimo:</w:t>
       </w:r>
     </w:p>
     <w:tbl>
@@ -11941,7 +11940,7 @@
           <w:sz w:val="20"/>
           <w:szCs w:val="20"/>
         </w:rPr>
-        <w:t>La confiabilidad de GesTock está respaldada por una batería automatizada en Jest con 308 pruebas ejecutadas con un 100% de éxito (297 de backend y 11 de contrato de la interfaz), complementadas con 92 verificaciones de extremo a extremo.</w:t>
+        <w:t>La confiabilidad de GesTock está respaldada por una batería automatizada en Jest con 297 pruebas ejecutadas con un 100% de éxito (286 de backend y 11 de contrato de la interfaz), complementadas con 92 verificaciones de extremo a extremo.</w:t>
       </w:r>
     </w:p>
     <w:tbl>
@@ -12961,7 +12960,7 @@
           <w:sz w:val="20"/>
           <w:szCs w:val="20"/>
         </w:rPr>
-        <w:t>Las 5 vistas de Kruchten articuladas con el modelo de datos relacional de 30 tablas.</w:t>
+        <w:t>Las 5 vistas de Kruchten articuladas con el modelo de datos relacional de 29 tablas.</w:t>
       </w:r>
     </w:p>
     <w:p>
@@ -13013,7 +13012,7 @@
           <w:sz w:val="20"/>
           <w:szCs w:val="20"/>
         </w:rPr>
-        <w:t>Desarrollo en TypeScript estricto, 308 pruebas automatizadas y arquitectura Cloud-Native con Docker Compose.</w:t>
+        <w:t>Desarrollo en TypeScript estricto, 297 pruebas automatizadas y arquitectura Cloud-Native con Docker Compose.</w:t>
       </w:r>
     </w:p>
     <w:sectPr>

</xml_diff>